<commit_message>
Corrigir docs (274/9/10/2,13×), Abstract, Tabelas 6/8 e referências.
Co-authored-by: Cursor <cursoragent@cursor.com>
</commit_message>
<xml_diff>
--- a/relatorio/SIGAVI_FINAL.docx
+++ b/relatorio/SIGAVI_FINAL.docx
@@ -3,52 +3,6 @@
 <w:document xmlns:wpc="http://schemas.microsoft.com/office/word/2010/wordprocessingCanvas" xmlns:cx="http://schemas.microsoft.com/office/drawing/2014/chartex" xmlns:cx1="http://schemas.microsoft.com/office/drawing/2015/9/8/chartex" xmlns:cx2="http://schemas.microsoft.com/office/drawing/2015/10/21/chartex" xmlns:cx3="http://schemas.microsoft.com/office/drawing/2016/5/9/chartex" xmlns:cx4="http://schemas.microsoft.com/office/drawing/2016/5/10/chartex" xmlns:cx5="http://schemas.microsoft.com/office/drawing/2016/5/11/chartex" xmlns:cx6="http://schemas.microsoft.com/office/drawing/2016/5/12/chartex" xmlns:cx7="http://schemas.microsoft.com/office/drawing/2016/5/13/chartex" xmlns:cx8="http://schemas.microsoft.com/office/drawing/2016/5/14/chartex" xmlns:mc="http://schemas.openxmlformats.org/markup-compatibility/2006" xmlns:aink="http://schemas.microsoft.com/office/drawing/2016/ink" xmlns:am3d="http://schemas.microsoft.com/office/drawing/2017/model3d" xmlns:o="urn:schemas-microsoft-com:office:office" xmlns:oel="http://schemas.microsoft.com/office/2019/extlst" xmlns:r="http://schemas.openxmlformats.org/officeDocument/2006/relationships" xmlns:m="http://schemas.openxmlformats.org/officeDocument/2006/math" xmlns:v="urn:schemas-microsoft-com:vml" xmlns:wp14="http://schemas.microsoft.com/office/word/2010/wordprocessingDrawing" xmlns:wp="http://schemas.openxmlformats.org/drawingml/2006/wordprocessingDrawing" xmlns:w10="urn:schemas-microsoft-com:office:word" xmlns:w="http://schemas.openxmlformats.org/wordprocessingml/2006/main" xmlns:w14="http://schemas.microsoft.com/office/word/2010/wordml" xmlns:w15="http://schemas.microsoft.com/office/word/2012/wordml" xmlns:w16cex="http://schemas.microsoft.com/office/word/2018/wordml/cex" xmlns:w16cid="http://schemas.microsoft.com/office/word/2016/wordml/cid" xmlns:w16="http://schemas.microsoft.com/office/word/2018/wordml" xmlns:w16du="http://schemas.microsoft.com/office/word/2023/wordml/word16du" xmlns:w16sdtdh="http://schemas.microsoft.com/office/word/2020/wordml/sdtdatahash" xmlns:w16sdtfl="http://schemas.microsoft.com/office/word/2024/wordml/sdtformatlock" xmlns:w16se="http://schemas.microsoft.com/office/word/2015/wordml/symex" xmlns:wpg="http://schemas.microsoft.com/office/word/2010/wordprocessingGroup" xmlns:wpi="http://schemas.microsoft.com/office/word/2010/wordprocessingInk" xmlns:wne="http://schemas.microsoft.com/office/word/2006/wordml" xmlns:wps="http://schemas.microsoft.com/office/word/2010/wordprocessingShape" mc:Ignorable="w14 w15 w16se w16cid w16 w16cex w16sdtdh w16sdtfl w16du wp14">
   <w:body>
     <w:bookmarkEnd w:id="1"/>
-    <w:p>
-      <w:pPr>
-        <w:pStyle w:val="Corpodetexto"/>
-        <w:rPr>
-          <w:sz w:val="20"/>
-        </w:rPr>
-      </w:pPr>
-    </w:p>
-    <w:p>
-      <w:pPr>
-        <w:pStyle w:val="Corpodetexto"/>
-        <w:rPr>
-          <w:sz w:val="20"/>
-        </w:rPr>
-      </w:pPr>
-    </w:p>
-    <w:p>
-      <w:pPr>
-        <w:pStyle w:val="Corpodetexto"/>
-        <w:rPr>
-          <w:sz w:val="20"/>
-        </w:rPr>
-      </w:pPr>
-    </w:p>
-    <w:p>
-      <w:pPr>
-        <w:spacing w:before="80"/>
-        <w:ind w:right="-1"/>
-        <w:rPr>
-          <w:rFonts w:ascii="Times New Roman" w:hAnsi="Times New Roman" w:cs="Times New Roman"/>
-          <w:b/>
-          <w:w w:val="95"/>
-          <w:sz w:val="32"/>
-        </w:rPr>
-      </w:pPr>
-    </w:p>
-    <w:p>
-      <w:pPr>
-        <w:pStyle w:val="Corpodetexto"/>
-        <w:ind w:right="-1" w:hanging="672"/>
-        <w:rPr>
-          <w:b/>
-          <w:sz w:val="36"/>
-        </w:rPr>
-      </w:pPr>
-    </w:p>
     <w:p>
       <w:pPr>
         <w:pStyle w:val="Corpodetexto"/>
@@ -59,38 +13,6 @@
         <w:ind w:right="-1"/>
         <w:jc w:val="center"/>
         <w:rPr>
-          <w:b/>
-          <w:w w:val="95"/>
-          <w:sz w:val="32"/>
-        </w:rPr>
-      </w:pPr>
-    </w:p>
-    <w:p>
-      <w:pPr>
-        <w:pStyle w:val="Corpodetexto"/>
-        <w:tabs>
-          <w:tab w:val="left" w:pos="3024"/>
-        </w:tabs>
-        <w:spacing w:before="8"/>
-        <w:ind w:right="-1"/>
-        <w:jc w:val="center"/>
-        <w:rPr>
-          <w:b/>
-          <w:w w:val="95"/>
-          <w:sz w:val="32"/>
-        </w:rPr>
-      </w:pPr>
-    </w:p>
-    <w:p>
-      <w:pPr>
-        <w:pStyle w:val="Corpodetexto"/>
-        <w:tabs>
-          <w:tab w:val="left" w:pos="3024"/>
-        </w:tabs>
-        <w:spacing w:before="8"/>
-        <w:ind w:right="-1"/>
-        <w:jc w:val="center"/>
-        <w:rPr>
           <w:rFonts w:ascii="Cambria" w:hAnsi="Cambria"/>
           <w:b/>
           <w:w w:val="95"/>
@@ -356,23 +278,6 @@
         </w:rPr>
         <w:t>Ribeiro Gaspar</w:t>
       </w:r>
-    </w:p>
-    <w:p>
-      <w:pPr>
-        <w:pStyle w:val="Corpodetexto"/>
-        <w:tabs>
-          <w:tab w:val="left" w:pos="3024"/>
-        </w:tabs>
-        <w:spacing w:before="8"/>
-        <w:ind w:right="-1"/>
-        <w:jc w:val="center"/>
-        <w:rPr>
-          <w:rFonts w:ascii="Cambria" w:hAnsi="Cambria"/>
-          <w:b/>
-          <w:w w:val="95"/>
-          <w:sz w:val="32"/>
-        </w:rPr>
-      </w:pPr>
     </w:p>
     <w:p>
       <w:pPr>
@@ -5984,7 +5889,7 @@
           <w:sz w:val="24"/>
           <w:szCs w:val="24"/>
         </w:rPr>
-        <w:t>Results show concentration in the Algarve and Setúbal–Lisbon axis. The MLP achieves ROC-AUC 0.93 ± 0.02. Porto and Portimão cover 100 % of risk (MCLP k=2); 9 AR5 sustain 24 h surveillance with five or twelve launch bases. The DSS captures 2,13× more risk than random patrol (95 % CI 2.01–2.35) and places 85.2 % of 2023–2024 seizures in high-risk cells (n=54). Concelho-level geocoding (231/335 maritime seizures). Web prototype with demo AIS.</w:t>
+        <w:t>Results show concentration in the Algarve and Setúbal–Lisbon axis. The MLP achieves ROC-AUC 0.93 ± 0.02. Porto and Portimão cover 100 % of risk (MCLP k=2); 9 AR5 sustain 24 h surveillance with distributed launch bases. The DSS captures 2.13× more risk than random patrol (95% CI 1.97–2.31) and places 85.2 % of 2023–2024 seizures in high-risk cells (n=54). Concelho-level geocoding (231/335 maritime seizures). Web prototype with demo AIS.</w:t>
       </w:r>
       <w:proofErr w:type="spellEnd"/>
       <w:r>
@@ -17413,7 +17318,7 @@
                 <w:b/>
                 <w:sz w:val="20"/>
               </w:rPr>
-              <w:t>Bases de lançamento (dimensionamento frota) de lançamento (dimensionamento frota) de lançamento (dimensionamento frota)</w:t>
+              <w:t>Bases de lançamento</w:t>
             </w:r>
           </w:p>
         </w:tc>
@@ -26162,276 +26067,249 @@
           <w:szCs w:val="24"/>
           <w:lang w:val="en-US"/>
         </w:rPr>
-        <w:t xml:space="preserve">O </w:t>
-      </w:r>
-      <w:proofErr w:type="spellStart"/>
-      <w:r>
-        <w:rPr>
-          <w:rFonts w:ascii="Times New Roman" w:hAnsi="Times New Roman" w:cs="Times New Roman"/>
-          <w:sz w:val="24"/>
-          <w:szCs w:val="24"/>
-          <w:lang w:val="en-US"/>
-        </w:rPr>
-        <w:t>procedimento</w:t>
-      </w:r>
-      <w:proofErr w:type="spellEnd"/>
-      <w:r>
-        <w:rPr>
-          <w:rFonts w:ascii="Times New Roman" w:hAnsi="Times New Roman" w:cs="Times New Roman"/>
-          <w:sz w:val="24"/>
-          <w:szCs w:val="24"/>
-          <w:lang w:val="en-US"/>
-        </w:rPr>
-        <w:t xml:space="preserve"> de </w:t>
-      </w:r>
-      <w:proofErr w:type="spellStart"/>
-      <w:r>
-        <w:rPr>
-          <w:rFonts w:ascii="Times New Roman" w:hAnsi="Times New Roman" w:cs="Times New Roman"/>
-          <w:sz w:val="24"/>
-          <w:szCs w:val="24"/>
-          <w:lang w:val="en-US"/>
-        </w:rPr>
-        <w:t>arranque</w:t>
-      </w:r>
-      <w:proofErr w:type="spellEnd"/>
-      <w:r>
-        <w:rPr>
-          <w:rFonts w:ascii="Times New Roman" w:hAnsi="Times New Roman" w:cs="Times New Roman"/>
-          <w:sz w:val="24"/>
-          <w:szCs w:val="24"/>
-          <w:lang w:val="en-US"/>
-        </w:rPr>
-        <w:t xml:space="preserve"> da </w:t>
-      </w:r>
-      <w:proofErr w:type="spellStart"/>
-      <w:r>
-        <w:rPr>
-          <w:rFonts w:ascii="Times New Roman" w:hAnsi="Times New Roman" w:cs="Times New Roman"/>
-          <w:sz w:val="24"/>
-          <w:szCs w:val="24"/>
-          <w:lang w:val="en-US"/>
-        </w:rPr>
-        <w:t>plataforma</w:t>
-      </w:r>
-      <w:proofErr w:type="spellEnd"/>
-      <w:r>
-        <w:rPr>
-          <w:rFonts w:ascii="Times New Roman" w:hAnsi="Times New Roman" w:cs="Times New Roman"/>
-          <w:sz w:val="24"/>
-          <w:szCs w:val="24"/>
-          <w:lang w:val="en-US"/>
-        </w:rPr>
-        <w:t xml:space="preserve"> (</w:t>
-      </w:r>
-      <w:proofErr w:type="spellStart"/>
-      <w:r>
-        <w:rPr>
-          <w:rFonts w:ascii="Times New Roman" w:hAnsi="Times New Roman" w:cs="Times New Roman"/>
-          <w:sz w:val="24"/>
-          <w:szCs w:val="24"/>
-          <w:lang w:val="en-US"/>
-        </w:rPr>
-        <w:t>instalação</w:t>
-      </w:r>
-      <w:proofErr w:type="spellEnd"/>
-      <w:r>
-        <w:rPr>
-          <w:rFonts w:ascii="Times New Roman" w:hAnsi="Times New Roman" w:cs="Times New Roman"/>
-          <w:sz w:val="24"/>
-          <w:szCs w:val="24"/>
-          <w:lang w:val="en-US"/>
-        </w:rPr>
-        <w:t xml:space="preserve"> de </w:t>
-      </w:r>
-      <w:proofErr w:type="spellStart"/>
-      <w:r>
-        <w:rPr>
-          <w:rFonts w:ascii="Times New Roman" w:hAnsi="Times New Roman" w:cs="Times New Roman"/>
-          <w:sz w:val="24"/>
-          <w:szCs w:val="24"/>
-          <w:lang w:val="en-US"/>
-        </w:rPr>
-        <w:t>dependências</w:t>
-      </w:r>
-      <w:proofErr w:type="spellEnd"/>
-      <w:r>
-        <w:rPr>
-          <w:rFonts w:ascii="Times New Roman" w:hAnsi="Times New Roman" w:cs="Times New Roman"/>
-          <w:sz w:val="24"/>
-          <w:szCs w:val="24"/>
-          <w:lang w:val="en-US"/>
-        </w:rPr>
-        <w:t xml:space="preserve"> e </w:t>
-      </w:r>
-      <w:proofErr w:type="spellStart"/>
-      <w:r>
-        <w:rPr>
-          <w:rFonts w:ascii="Times New Roman" w:hAnsi="Times New Roman" w:cs="Times New Roman"/>
-          <w:sz w:val="24"/>
-          <w:szCs w:val="24"/>
-          <w:lang w:val="en-US"/>
-        </w:rPr>
-        <w:t>lançamento</w:t>
-      </w:r>
-      <w:proofErr w:type="spellEnd"/>
-      <w:r>
-        <w:rPr>
-          <w:rFonts w:ascii="Times New Roman" w:hAnsi="Times New Roman" w:cs="Times New Roman"/>
-          <w:sz w:val="24"/>
-          <w:szCs w:val="24"/>
-          <w:lang w:val="en-US"/>
-        </w:rPr>
-        <w:t xml:space="preserve"> dos </w:t>
-      </w:r>
-      <w:proofErr w:type="spellStart"/>
-      <w:r>
-        <w:rPr>
-          <w:rFonts w:ascii="Times New Roman" w:hAnsi="Times New Roman" w:cs="Times New Roman"/>
-          <w:sz w:val="24"/>
-          <w:szCs w:val="24"/>
-          <w:lang w:val="en-US"/>
-        </w:rPr>
-        <w:t>serviços</w:t>
-      </w:r>
-      <w:proofErr w:type="spellEnd"/>
-      <w:r>
-        <w:rPr>
-          <w:rFonts w:ascii="Times New Roman" w:hAnsi="Times New Roman" w:cs="Times New Roman"/>
-          <w:sz w:val="24"/>
-          <w:szCs w:val="24"/>
-          <w:lang w:val="en-US"/>
-        </w:rPr>
-        <w:t xml:space="preserve">) </w:t>
-      </w:r>
-      <w:proofErr w:type="spellStart"/>
-      <w:r>
-        <w:rPr>
-          <w:rFonts w:ascii="Times New Roman" w:hAnsi="Times New Roman" w:cs="Times New Roman"/>
-          <w:sz w:val="24"/>
-          <w:szCs w:val="24"/>
-          <w:lang w:val="en-US"/>
-        </w:rPr>
-        <w:t>está</w:t>
-      </w:r>
-      <w:proofErr w:type="spellEnd"/>
-      <w:r>
-        <w:rPr>
-          <w:rFonts w:ascii="Times New Roman" w:hAnsi="Times New Roman" w:cs="Times New Roman"/>
-          <w:sz w:val="24"/>
-          <w:szCs w:val="24"/>
-          <w:lang w:val="en-US"/>
-        </w:rPr>
-        <w:t xml:space="preserve"> </w:t>
-      </w:r>
-      <w:proofErr w:type="spellStart"/>
-      <w:r>
-        <w:rPr>
-          <w:rFonts w:ascii="Times New Roman" w:hAnsi="Times New Roman" w:cs="Times New Roman"/>
-          <w:sz w:val="24"/>
-          <w:szCs w:val="24"/>
-          <w:lang w:val="en-US"/>
-        </w:rPr>
-        <w:t>descrito</w:t>
-      </w:r>
-      <w:proofErr w:type="spellEnd"/>
-      <w:r>
-        <w:rPr>
-          <w:rFonts w:ascii="Times New Roman" w:hAnsi="Times New Roman" w:cs="Times New Roman"/>
-          <w:sz w:val="24"/>
-          <w:szCs w:val="24"/>
-          <w:lang w:val="en-US"/>
-        </w:rPr>
-        <w:t xml:space="preserve"> no Anexo C </w:t>
-      </w:r>
-      <w:r>
-        <w:rPr>
-          <w:rFonts w:ascii="Times New Roman" w:hAnsi="Times New Roman" w:cs="Times New Roman"/>
-          <w:sz w:val="24"/>
-          <w:szCs w:val="24"/>
-          <w:lang w:val="en-US"/>
-        </w:rPr>
-        <w:t xml:space="preserve">- </w:t>
-      </w:r>
-      <w:proofErr w:type="spellStart"/>
-      <w:r>
-        <w:rPr>
-          <w:rFonts w:ascii="Times New Roman" w:hAnsi="Times New Roman" w:cs="Times New Roman"/>
-          <w:sz w:val="24"/>
-          <w:szCs w:val="24"/>
-          <w:lang w:val="en-US"/>
-        </w:rPr>
-        <w:t>Reprodução</w:t>
-      </w:r>
-      <w:proofErr w:type="spellEnd"/>
-      <w:r>
-        <w:rPr>
-          <w:rFonts w:ascii="Times New Roman" w:hAnsi="Times New Roman" w:cs="Times New Roman"/>
-          <w:sz w:val="24"/>
-          <w:szCs w:val="24"/>
-          <w:lang w:val="en-US"/>
-        </w:rPr>
-        <w:t xml:space="preserve"> </w:t>
-      </w:r>
-      <w:proofErr w:type="spellStart"/>
-      <w:r>
-        <w:rPr>
-          <w:rFonts w:ascii="Times New Roman" w:hAnsi="Times New Roman" w:cs="Times New Roman"/>
-          <w:sz w:val="24"/>
-          <w:szCs w:val="24"/>
-          <w:lang w:val="en-US"/>
-        </w:rPr>
-        <w:t>computacional</w:t>
-      </w:r>
-      <w:proofErr w:type="spellEnd"/>
-      <w:r>
-        <w:rPr>
-          <w:rFonts w:ascii="Times New Roman" w:hAnsi="Times New Roman" w:cs="Times New Roman"/>
-          <w:sz w:val="24"/>
-          <w:szCs w:val="24"/>
-          <w:lang w:val="en-US"/>
-        </w:rPr>
-        <w:t xml:space="preserve"> e </w:t>
-      </w:r>
-      <w:proofErr w:type="spellStart"/>
-      <w:r>
-        <w:rPr>
-          <w:rFonts w:ascii="Times New Roman" w:hAnsi="Times New Roman" w:cs="Times New Roman"/>
-          <w:sz w:val="24"/>
-          <w:szCs w:val="24"/>
-          <w:lang w:val="en-US"/>
-        </w:rPr>
-        <w:t>arranque</w:t>
-      </w:r>
-      <w:proofErr w:type="spellEnd"/>
-      <w:r>
-        <w:rPr>
-          <w:rFonts w:ascii="Times New Roman" w:hAnsi="Times New Roman" w:cs="Times New Roman"/>
-          <w:sz w:val="24"/>
-          <w:szCs w:val="24"/>
-          <w:lang w:val="en-US"/>
-        </w:rPr>
-        <w:t xml:space="preserve"> da </w:t>
-      </w:r>
-      <w:proofErr w:type="spellStart"/>
-      <w:r>
-        <w:rPr>
-          <w:rFonts w:ascii="Times New Roman" w:hAnsi="Times New Roman" w:cs="Times New Roman"/>
-          <w:sz w:val="24"/>
-          <w:szCs w:val="24"/>
-          <w:lang w:val="en-US"/>
-        </w:rPr>
-        <w:t>plataforma</w:t>
-      </w:r>
-      <w:proofErr w:type="spellEnd"/>
-      <w:r>
-        <w:rPr>
-          <w:rFonts w:ascii="Times New Roman" w:hAnsi="Times New Roman" w:cs="Times New Roman"/>
-          <w:sz w:val="24"/>
-          <w:szCs w:val="24"/>
-          <w:lang w:val="en-US"/>
-        </w:rPr>
-        <w:t>.</w:t>
+        <w:t>O procedimento de arranque da plataforma (instalação de dependências e lançamento dos serviços) está descrito no Secção 6 e plataforma/README.md - Reprodução computacional e arranque da plataforma.</w:t>
+      </w:r>
+      <w:proofErr w:type="spellStart"/>
+      <w:r>
+        <w:rPr>
+          <w:rFonts w:ascii="Times New Roman" w:hAnsi="Times New Roman" w:cs="Times New Roman"/>
+          <w:sz w:val="24"/>
+          <w:szCs w:val="24"/>
+          <w:lang w:val="en-US"/>
+        </w:rPr>
+      </w:r>
+      <w:proofErr w:type="spellEnd"/>
+      <w:r>
+        <w:rPr>
+          <w:rFonts w:ascii="Times New Roman" w:hAnsi="Times New Roman" w:cs="Times New Roman"/>
+          <w:sz w:val="24"/>
+          <w:szCs w:val="24"/>
+          <w:lang w:val="en-US"/>
+        </w:rPr>
+      </w:r>
+      <w:proofErr w:type="spellStart"/>
+      <w:r>
+        <w:rPr>
+          <w:rFonts w:ascii="Times New Roman" w:hAnsi="Times New Roman" w:cs="Times New Roman"/>
+          <w:sz w:val="24"/>
+          <w:szCs w:val="24"/>
+          <w:lang w:val="en-US"/>
+        </w:rPr>
+      </w:r>
+      <w:proofErr w:type="spellEnd"/>
+      <w:r>
+        <w:rPr>
+          <w:rFonts w:ascii="Times New Roman" w:hAnsi="Times New Roman" w:cs="Times New Roman"/>
+          <w:sz w:val="24"/>
+          <w:szCs w:val="24"/>
+          <w:lang w:val="en-US"/>
+        </w:rPr>
+      </w:r>
+      <w:proofErr w:type="spellStart"/>
+      <w:r>
+        <w:rPr>
+          <w:rFonts w:ascii="Times New Roman" w:hAnsi="Times New Roman" w:cs="Times New Roman"/>
+          <w:sz w:val="24"/>
+          <w:szCs w:val="24"/>
+          <w:lang w:val="en-US"/>
+        </w:rPr>
+      </w:r>
+      <w:proofErr w:type="spellEnd"/>
+      <w:r>
+        <w:rPr>
+          <w:rFonts w:ascii="Times New Roman" w:hAnsi="Times New Roman" w:cs="Times New Roman"/>
+          <w:sz w:val="24"/>
+          <w:szCs w:val="24"/>
+          <w:lang w:val="en-US"/>
+        </w:rPr>
+      </w:r>
+      <w:proofErr w:type="spellStart"/>
+      <w:r>
+        <w:rPr>
+          <w:rFonts w:ascii="Times New Roman" w:hAnsi="Times New Roman" w:cs="Times New Roman"/>
+          <w:sz w:val="24"/>
+          <w:szCs w:val="24"/>
+          <w:lang w:val="en-US"/>
+        </w:rPr>
+      </w:r>
+      <w:proofErr w:type="spellEnd"/>
+      <w:r>
+        <w:rPr>
+          <w:rFonts w:ascii="Times New Roman" w:hAnsi="Times New Roman" w:cs="Times New Roman"/>
+          <w:sz w:val="24"/>
+          <w:szCs w:val="24"/>
+          <w:lang w:val="en-US"/>
+        </w:rPr>
+      </w:r>
+      <w:proofErr w:type="spellStart"/>
+      <w:r>
+        <w:rPr>
+          <w:rFonts w:ascii="Times New Roman" w:hAnsi="Times New Roman" w:cs="Times New Roman"/>
+          <w:sz w:val="24"/>
+          <w:szCs w:val="24"/>
+          <w:lang w:val="en-US"/>
+        </w:rPr>
+      </w:r>
+      <w:proofErr w:type="spellEnd"/>
+      <w:r>
+        <w:rPr>
+          <w:rFonts w:ascii="Times New Roman" w:hAnsi="Times New Roman" w:cs="Times New Roman"/>
+          <w:sz w:val="24"/>
+          <w:szCs w:val="24"/>
+          <w:lang w:val="en-US"/>
+        </w:rPr>
+      </w:r>
+      <w:proofErr w:type="spellStart"/>
+      <w:r>
+        <w:rPr>
+          <w:rFonts w:ascii="Times New Roman" w:hAnsi="Times New Roman" w:cs="Times New Roman"/>
+          <w:sz w:val="24"/>
+          <w:szCs w:val="24"/>
+          <w:lang w:val="en-US"/>
+        </w:rPr>
+      </w:r>
+      <w:proofErr w:type="spellEnd"/>
+      <w:r>
+        <w:rPr>
+          <w:rFonts w:ascii="Times New Roman" w:hAnsi="Times New Roman" w:cs="Times New Roman"/>
+          <w:sz w:val="24"/>
+          <w:szCs w:val="24"/>
+          <w:lang w:val="en-US"/>
+        </w:rPr>
+      </w:r>
+      <w:proofErr w:type="spellStart"/>
+      <w:r>
+        <w:rPr>
+          <w:rFonts w:ascii="Times New Roman" w:hAnsi="Times New Roman" w:cs="Times New Roman"/>
+          <w:sz w:val="24"/>
+          <w:szCs w:val="24"/>
+          <w:lang w:val="en-US"/>
+        </w:rPr>
+      </w:r>
+      <w:proofErr w:type="spellEnd"/>
+      <w:r>
+        <w:rPr>
+          <w:rFonts w:ascii="Times New Roman" w:hAnsi="Times New Roman" w:cs="Times New Roman"/>
+          <w:sz w:val="24"/>
+          <w:szCs w:val="24"/>
+          <w:lang w:val="en-US"/>
+        </w:rPr>
+      </w:r>
+      <w:proofErr w:type="spellStart"/>
+      <w:r>
+        <w:rPr>
+          <w:rFonts w:ascii="Times New Roman" w:hAnsi="Times New Roman" w:cs="Times New Roman"/>
+          <w:sz w:val="24"/>
+          <w:szCs w:val="24"/>
+          <w:lang w:val="en-US"/>
+        </w:rPr>
+      </w:r>
+      <w:proofErr w:type="spellEnd"/>
+      <w:r>
+        <w:rPr>
+          <w:rFonts w:ascii="Times New Roman" w:hAnsi="Times New Roman" w:cs="Times New Roman"/>
+          <w:sz w:val="24"/>
+          <w:szCs w:val="24"/>
+          <w:lang w:val="en-US"/>
+        </w:rPr>
+      </w:r>
+      <w:proofErr w:type="spellStart"/>
+      <w:r>
+        <w:rPr>
+          <w:rFonts w:ascii="Times New Roman" w:hAnsi="Times New Roman" w:cs="Times New Roman"/>
+          <w:sz w:val="24"/>
+          <w:szCs w:val="24"/>
+          <w:lang w:val="en-US"/>
+        </w:rPr>
+      </w:r>
+      <w:proofErr w:type="spellEnd"/>
+      <w:r>
+        <w:rPr>
+          <w:rFonts w:ascii="Times New Roman" w:hAnsi="Times New Roman" w:cs="Times New Roman"/>
+          <w:sz w:val="24"/>
+          <w:szCs w:val="24"/>
+          <w:lang w:val="en-US"/>
+        </w:rPr>
+      </w:r>
+      <w:r>
+        <w:rPr>
+          <w:rFonts w:ascii="Times New Roman" w:hAnsi="Times New Roman" w:cs="Times New Roman"/>
+          <w:sz w:val="24"/>
+          <w:szCs w:val="24"/>
+          <w:lang w:val="en-US"/>
+        </w:rPr>
+      </w:r>
+      <w:proofErr w:type="spellStart"/>
+      <w:r>
+        <w:rPr>
+          <w:rFonts w:ascii="Times New Roman" w:hAnsi="Times New Roman" w:cs="Times New Roman"/>
+          <w:sz w:val="24"/>
+          <w:szCs w:val="24"/>
+          <w:lang w:val="en-US"/>
+        </w:rPr>
+      </w:r>
+      <w:proofErr w:type="spellEnd"/>
+      <w:r>
+        <w:rPr>
+          <w:rFonts w:ascii="Times New Roman" w:hAnsi="Times New Roman" w:cs="Times New Roman"/>
+          <w:sz w:val="24"/>
+          <w:szCs w:val="24"/>
+          <w:lang w:val="en-US"/>
+        </w:rPr>
+      </w:r>
+      <w:proofErr w:type="spellStart"/>
+      <w:r>
+        <w:rPr>
+          <w:rFonts w:ascii="Times New Roman" w:hAnsi="Times New Roman" w:cs="Times New Roman"/>
+          <w:sz w:val="24"/>
+          <w:szCs w:val="24"/>
+          <w:lang w:val="en-US"/>
+        </w:rPr>
+      </w:r>
+      <w:proofErr w:type="spellEnd"/>
+      <w:r>
+        <w:rPr>
+          <w:rFonts w:ascii="Times New Roman" w:hAnsi="Times New Roman" w:cs="Times New Roman"/>
+          <w:sz w:val="24"/>
+          <w:szCs w:val="24"/>
+          <w:lang w:val="en-US"/>
+        </w:rPr>
+      </w:r>
+      <w:proofErr w:type="spellStart"/>
+      <w:r>
+        <w:rPr>
+          <w:rFonts w:ascii="Times New Roman" w:hAnsi="Times New Roman" w:cs="Times New Roman"/>
+          <w:sz w:val="24"/>
+          <w:szCs w:val="24"/>
+          <w:lang w:val="en-US"/>
+        </w:rPr>
+      </w:r>
+      <w:proofErr w:type="spellEnd"/>
+      <w:r>
+        <w:rPr>
+          <w:rFonts w:ascii="Times New Roman" w:hAnsi="Times New Roman" w:cs="Times New Roman"/>
+          <w:sz w:val="24"/>
+          <w:szCs w:val="24"/>
+          <w:lang w:val="en-US"/>
+        </w:rPr>
+      </w:r>
+      <w:proofErr w:type="spellStart"/>
+      <w:r>
+        <w:rPr>
+          <w:rFonts w:ascii="Times New Roman" w:hAnsi="Times New Roman" w:cs="Times New Roman"/>
+          <w:sz w:val="24"/>
+          <w:szCs w:val="24"/>
+          <w:lang w:val="en-US"/>
+        </w:rPr>
+      </w:r>
+      <w:proofErr w:type="spellEnd"/>
+      <w:r>
+        <w:rPr>
+          <w:rFonts w:ascii="Times New Roman" w:hAnsi="Times New Roman" w:cs="Times New Roman"/>
+          <w:sz w:val="24"/>
+          <w:szCs w:val="24"/>
+          <w:lang w:val="en-US"/>
+        </w:rPr>
       </w:r>
     </w:p>
     <w:p>
@@ -29919,7 +29797,7 @@
                 <w:sz w:val="24"/>
                 <w:szCs w:val="24"/>
               </w:rPr>
-              <w:t>Holdout 2023–24: 85,2 % (n=54); interceções documentadas: 75 %; ganho 2,13× sem desembarques em zona alto risco; patrulha SAD 2,13× vs aleatória</w:t>
+              <w:t>Holdout 2023–2024: 85,2% (n=54); interceções documentadas: 75% em zona de alto risco; patrulha SAD 2,13× vs aleatória.sembarques em zona alto risco; patrulha SAD 2,13× vs aleatória</w:t>
             </w:r>
             <w:proofErr w:type="spellEnd"/>
             <w:r>
@@ -31337,7 +31215,7 @@
           <w:sz w:val="24"/>
           <w:szCs w:val="24"/>
         </w:rPr>
-        <w:t>Fontes *proxy*: EMODnet mede atividade AIS, não ilegalidade directa; imigração assenta em 20 desembarques PT + IOM filtrado. Geocodificação por concelho: 231/335 apreensões marítimas (proxy offshore 12 km). Backtest: droga e imigração filtradas até 2022 na variante rigorosa; pesca/poluição estáticas (EMODnet). Pesos AHP adoptados directamente (Secção 4.5). Classificação MLP: ROC-AUC elevada mas precisão da classe minoritária modesta (3,4 % marítimo). Índice offline vs. plataforma: risco estratégico estático. Validação externa: Tabela 10 (4 interceções documentadas, 75 % em alto risco) complementa o backtest.</w:t>
+        <w:t>Fontes *proxy*: EMODnet mede atividade AIS, não ilegalidade directa; imigração assenta em 20 desembarques PT + IOM filtrado. Geocodificação por concelho: 231/335 apreensões marítimas (proxy offshore 12 km). Backtest: droga e imigração filtradas até 2022 na variante rigorosa; pesca/poluição estáticas (EMODnet). Pesos AHP arredondados (Secção 4.5). Classificação MLP: ROC-AUC elevada mas precisão da classe minoritária modesta (3,4 % marítimo). Índice offline vs. plataforma: risco estratégico estático. Validação externa: interceções documentadas (Secção 7.3; 4 eventos, 75 % em alto risco) complementa o backtest.</w:t>
       </w:r>
       <w:proofErr w:type="spellStart"/>
       <w:r>

</xml_diff>